<commit_message>
Paula Fernandes: revisão da Parte 3
Co-Authored-By: Claude Opus 5.5 <noreply@anthropic.com>
Claude-Session: https://claude.ai/code/session_01MJjUEEZrxQDEUifKK2vj9g
</commit_message>
<xml_diff>
--- a/roteiros/paula-fernandes/Paula_Parte3.docx
+++ b/roteiros/paula-fernandes/Paula_Parte3.docx
@@ -23,7 +23,7 @@
         <w:rPr>
           <w:color w:val="000000"/>
         </w:rPr>
-        <w:t>O braço ainda doía do acidente. A foto do carro capotado ainda circulava nas redes.</w:t>
+        <w:t>Fazia duas semanas que o carro de Paula tinha capotado na Castello Branco. A foto do carro destruído ainda circulava nas redes.</w:t>
       </w:r>
     </w:p>
     <w:p>
@@ -31,7 +31,7 @@
         <w:rPr>
           <w:color w:val="000000"/>
         </w:rPr>
-        <w:t>Paula sentou para gravar uma conversa num podcast chamado Papo com Clê.</w:t>
+        <w:t>Foi nesse momento que ela sentou para gravar uma conversa num podcast chamado Papo com Clê. Em certo ponto, o assunto chegou aos anos difíceis.</w:t>
       </w:r>
     </w:p>
     <w:p>
@@ -39,15 +39,7 @@
         <w:rPr>
           <w:color w:val="000000"/>
         </w:rPr>
-        <w:t>A conversa começou leve. Carreira, música, lembranças da roça. Até que o assunto chegou aos anos difíceis.</w:t>
-      </w:r>
-    </w:p>
-    <w:p>
-      <w:r>
-        <w:rPr>
-          <w:color w:val="000000"/>
-        </w:rPr>
-        <w:t>Duas semanas antes, ela tinha escrito que o acidente tinha sido o dia mais difícil da vida dela. Naquele estúdio, ia mostrar que existia outro dia, muito mais antigo, que ela nunca tinha contado a ninguém fora da família.</w:t>
+        <w:t>Logo depois do acidente, ela tinha escrito que o acidente tinha sido o dia mais difícil da vida dela. Naquele estúdio, ia mostrar que existia outro dia, muito mais antigo, que ela nunca tinha contado a ninguém fora da família.</w:t>
       </w:r>
     </w:p>
     <w:p>
@@ -87,7 +79,7 @@
         <w:rPr>
           <w:color w:val="000000"/>
         </w:rPr>
-        <w:t>Era a primeira vez que ela levava aquela história para fora de casa.</w:t>
+        <w:t>Pouca gente fora da família conhecia aquela história.</w:t>
       </w:r>
     </w:p>
     <w:p>
@@ -103,7 +95,7 @@
         <w:rPr>
           <w:color w:val="000000"/>
         </w:rPr>
-        <w:t>Com a voz calma, ela foi muito além disso.</w:t>
+        <w:t>Ela foi muito além disso.</w:t>
       </w:r>
     </w:p>
     <w:p>
@@ -135,7 +127,7 @@
         <w:rPr>
           <w:color w:val="1F4EB4"/>
         </w:rPr>
-        <w:t>Aos dezoito anos. A mesma menina da botina, do disco de vinil, dos rodeios. A mesma voz que, poucos anos depois, o Brasil inteiro ia ouvir no horário nobre.</w:t>
+        <w:t>Aos dezoito anos. A mesma menina da botina e do disco de vinil. A mesma voz que, poucos anos depois, o Brasil inteiro ia ouvir no horário nobre.</w:t>
       </w:r>
     </w:p>
     <w:p>
@@ -143,7 +135,7 @@
         <w:rPr>
           <w:color w:val="1F4EB4"/>
         </w:rPr>
-        <w:t>Naquela noite, havia outra pessoa ali.</w:t>
+        <w:t>Naquele momento, havia outra pessoa ali.</w:t>
       </w:r>
     </w:p>
     <w:p>
@@ -223,7 +215,7 @@
         <w:rPr>
           <w:color w:val="1F4EB4"/>
         </w:rPr>
-        <w:t>Esse era o segredo que Paula Fernandes guardou durante quase vinte anos de carreira.</w:t>
+        <w:t>Esse era o segredo que Paula Fernandes guardou durante quase vinte anos.</w:t>
       </w:r>
     </w:p>
     <w:p>
@@ -391,7 +383,7 @@
         <w:rPr>
           <w:color w:val="000000"/>
         </w:rPr>
-        <w:t>A mulher que tinha vendido mais de um milhão e meio de DVDs agora via fãs quebrando esses mesmos DVDs por causa da fé dela.</w:t>
+        <w:t>A mulher que tinha vendido mais de um milhão e meio de DVDs agora via ex-fãs anunciando que tinham destruído os DVDs dela por causa da fé.</w:t>
       </w:r>
     </w:p>
     <w:p>
@@ -519,7 +511,7 @@
         <w:rPr>
           <w:color w:val="C00000"/>
         </w:rPr>
-        <w:t>Guarde esse celular. Porque o que ela encontrou ali dentro foi só o começo do ano mais solitário da vida dela. E ajuda a entender por que, anos depois, ela decidiu falar sobre coisas que muitas mulheres do meio artístico preferem esconder.</w:t>
+        <w:t>Guarde esse celular. Porque o que ela encontrou ali dentro derrubou o pouco que ainda restava de chão na vida pessoal dela naquele ano. E deixou Paula ainda mais sozinha num meio onde, como ela contaria anos depois, já se sentia cercada.</w:t>
       </w:r>
     </w:p>
     <w:p>
@@ -559,7 +551,7 @@
         <w:rPr>
           <w:color w:val="C00000"/>
         </w:rPr>
-        <w:t>Porque, enquanto a imprensa inventava histórias sobre cama de casal no camarim, Paula vivia nos bastidores situações muito mais graves. Situações que ela só teve coragem de revelar dez anos depois. E que mostram o lado mais sujo da indústria que transformou a menina de botina numa estrela.</w:t>
+        <w:t>Porque, enquanto a imprensa se divertia com histórias sobre cama de casal no camarim, Paula vivia nos bastidores situações muito mais graves. Situações que ela só teve coragem de revelar dez anos depois. E que mostram o lado mais sujo da indústria que transformou a menina de botina numa estrela.</w:t>
       </w:r>
     </w:p>
     <w:sectPr>

</xml_diff>